<commit_message>
docs: actualizar guia de despliegue con dominios de cloudflared (trycloudflare y bot.aspenqlio.com)
</commit_message>
<xml_diff>
--- a/docs/Guia_Despliegue_Servidor_y_Tunel_Municipal.docx
+++ b/docs/Guia_Despliegue_Servidor_y_Tunel_Municipal.docx
@@ -738,7 +738,7 @@
           <w:color w:val="128C7E"/>
           <w:sz w:val="28"/>
         </w:rPr>
-        <w:t>4. Paso 3: Configuración del Túnel Seguro (Zero-Trust)</w:t>
+        <w:t>4. Paso 3: Configuración del Dominio y Túnel Seguro con Cloudflared</w:t>
       </w:r>
     </w:p>
     <w:p>
@@ -746,7 +746,16 @@
         <w:spacing w:after="80"/>
       </w:pPr>
       <w:r>
-        <w:t xml:space="preserve">Para exponer el asistente en un subdominio municipal (ej. </w:t>
+        <w:t xml:space="preserve">Para exponer el asistente en un dominio seguro con HTTPS y mitigación DDoS sin abrir puertos en el firewall institucional, se utiliza Cloudflare Tunnel (agente 'cloudflared'). El agente establece túneles salientes TLS hacia la red global de Cloudflare, permitiendo operar tanto en un dominio de prueba temporal gratuito como en el dominio oficial institucional (ej. </w:t>
+      </w:r>
+      <w:r>
+        <w:rPr>
+          <w:b/>
+        </w:rPr>
+        <w:t>bot.aspenqlio.com</w:t>
+      </w:r>
+      <w:r>
+        <w:t xml:space="preserve"> o </w:t>
       </w:r>
       <w:r>
         <w:rPr>
@@ -755,7 +764,7 @@
         <w:t>chatbot.lacisterna.cl</w:t>
       </w:r>
       <w:r>
-        <w:t xml:space="preserve">) sin comprometer la seguridad de la red interna, se utiliza Cloudflare Tunnel. El agente 'cloudflared' establece una conexión saliente TLS hacia el edge de Cloudflare. Ventajas de seguridad: </w:t>
+        <w:t>).</w:t>
       </w:r>
     </w:p>
     <w:p>
@@ -780,7 +789,7 @@
         <w:rPr>
           <w:b/>
         </w:rPr>
-        <w:t xml:space="preserve">Certificado SSL Automático: </w:t>
+        <w:t xml:space="preserve">Certificado SSL/TLS Automático: </w:t>
       </w:r>
       <w:r>
         <w:t>Cloudflare gestiona el cifrado HTTPS y la renovación de certificados.</w:t>
@@ -794,10 +803,10 @@
         <w:rPr>
           <w:b/>
         </w:rPr>
-        <w:t xml:space="preserve">Protección DDoS: </w:t>
+        <w:t xml:space="preserve">Protección DDoS Perimetral: </w:t>
       </w:r>
       <w:r>
-        <w:t>Mitigación perimetral de denegación de servicio y filtrado de bots maliciosos.</w:t>
+        <w:t>Mitigación de ataques y bloqueo de tráfico malicioso antes de llegar al servidor.</w:t>
       </w:r>
     </w:p>
     <w:p>
@@ -812,7 +821,15 @@
           <w:color w:val="1F4E79"/>
           <w:sz w:val="24"/>
         </w:rPr>
-        <w:t>Instalación y Configuración del Túnel en el Servidor</w:t>
+        <w:t>Modalidad A: Túnel Rápido de Prueba Inmediata (Sin Cuenta ni DNS)</w:t>
+      </w:r>
+    </w:p>
+    <w:p>
+      <w:pPr>
+        <w:spacing w:after="80"/>
+      </w:pPr>
+      <w:r>
+        <w:t>Para pruebas inmediatas por el equipo de desarrollo web, se puede generar un túnel rápido que entrega un dominio público HTTPS al instante:</w:t>
       </w:r>
     </w:p>
     <w:tbl>
@@ -846,7 +863,79 @@
                 <w:color w:val="1E1E1E"/>
                 <w:sz w:val="18"/>
               </w:rPr>
-              <w:t># 1. Instalar el paquete cloudflared en Ubuntu/Debian</w:t>
+              <w:t># Levantar túnel de prueba temporal hacia el contenedor local</w:t>
+              <w:br/>
+              <w:t>cloudflared tunnel --url http://localhost:8000</w:t>
+              <w:br/>
+              <w:br/>
+              <w:t># Genera una URL pública segura accesible desde internet, ejemplo:</w:t>
+              <w:br/>
+              <w:t># https://retrieved-too-lance-metabolism.trycloudflare.com</w:t>
+            </w:r>
+          </w:p>
+        </w:tc>
+      </w:tr>
+    </w:tbl>
+    <w:p>
+      <w:pPr>
+        <w:spacing w:before="40" w:after="80"/>
+      </w:pPr>
+    </w:p>
+    <w:p>
+      <w:pPr>
+        <w:keepNext/>
+        <w:spacing w:before="240" w:after="80"/>
+      </w:pPr>
+      <w:r>
+        <w:rPr>
+          <w:rFonts w:ascii="Calibri" w:hAnsi="Calibri"/>
+          <w:b/>
+          <w:color w:val="1F4E79"/>
+          <w:sz w:val="24"/>
+        </w:rPr>
+        <w:t>Modalidad B: Dominio Institucional Oficial Permanente (con Cloudflare)</w:t>
+      </w:r>
+    </w:p>
+    <w:p>
+      <w:pPr>
+        <w:spacing w:after="80"/>
+      </w:pPr>
+      <w:r>
+        <w:t>Para asociar el túnel al dominio municipal oficial permanente:</w:t>
+      </w:r>
+    </w:p>
+    <w:tbl>
+      <w:tblPr>
+        <w:tblW w:type="auto" w:w="0"/>
+        <w:jc w:val="center"/>
+        <w:tblLook w:firstColumn="1" w:firstRow="1" w:lastColumn="0" w:lastRow="0" w:noHBand="0" w:noVBand="1" w:val="04A0"/>
+      </w:tblPr>
+      <w:tblGrid>
+        <w:gridCol w:w="9936"/>
+      </w:tblGrid>
+      <w:tr>
+        <w:tc>
+          <w:tcPr>
+            <w:tcW w:type="dxa" w:w="9360"/>
+            <w:shd w:fill="F2F4F7"/>
+            <w:tcMar>
+              <w:top w:w="120" w:type="dxa"/>
+              <w:bottom w:w="120" w:type="dxa"/>
+              <w:left w:w="200" w:type="dxa"/>
+              <w:right w:w="200" w:type="dxa"/>
+            </w:tcMar>
+          </w:tcPr>
+          <w:p>
+            <w:pPr>
+              <w:spacing w:before="40" w:after="40"/>
+            </w:pPr>
+            <w:r>
+              <w:rPr>
+                <w:rFonts w:ascii="Consolas" w:hAnsi="Consolas"/>
+                <w:color w:val="1E1E1E"/>
+                <w:sz w:val="18"/>
+              </w:rPr>
+              <w:t># 1. Instalar cloudflared en el servidor Linux</w:t>
               <w:br/>
               <w:t>curl -fsSL https://pkg.cloudflare.com/cloudflare-main.gpg | sudo tee /usr/share/keyrings/cloudflare-main.gpg &gt;/dev/null</w:t>
               <w:br/>
@@ -860,14 +949,16 @@
               <w:t>cloudflared tunnel login</w:t>
               <w:br/>
               <w:br/>
-              <w:t># 3. Crear el túnel con nombre institucional</w:t>
+              <w:t># 3. Crear el túnel nombrado</w:t>
               <w:br/>
               <w:t>cloudflared tunnel create cisternin-produccion</w:t>
               <w:br/>
               <w:br/>
-              <w:t># 4. Enrutar el DNS del subdominio oficial hacia el túnel</w:t>
+              <w:t># 4. Enrutar el dominio oficial hacia el túnel</w:t>
               <w:br/>
-              <w:t>cloudflared tunnel route dns cisternin-produccion chatbot.lacisterna.cl</w:t>
+              <w:t>cloudflared tunnel route dns cisternin-produccion bot.aspenqlio.com</w:t>
+              <w:br/>
+              <w:t># (o hacia el subdominio municipal: chatbot.lacisterna.cl)</w:t>
             </w:r>
           </w:p>
         </w:tc>
@@ -930,6 +1021,10 @@
               <w:br/>
               <w:t>ingress:</w:t>
               <w:br/>
+              <w:t xml:space="preserve">  - hostname: bot.aspenqlio.com</w:t>
+              <w:br/>
+              <w:t xml:space="preserve">    service: http://localhost:8000</w:t>
+              <w:br/>
               <w:t xml:space="preserve">  - hostname: chatbot.lacisterna.cl</w:t>
               <w:br/>
               <w:t xml:space="preserve">    service: http://localhost:8000</w:t>
@@ -950,7 +1045,7 @@
         <w:spacing w:after="80"/>
       </w:pPr>
       <w:r>
-        <w:t>Instalar y habilitar el túnel como servicio del sistema operativo:</w:t>
+        <w:t>Habilitar el servicio para ejecución automática permanente 24/7:</w:t>
       </w:r>
     </w:p>
     <w:tbl>
@@ -1009,7 +1104,7 @@
           <w:color w:val="128C7E"/>
           <w:sz w:val="28"/>
         </w:rPr>
-        <w:t>5. Paso 4: Integración del Widget Flotante en www.cisterna.cl</w:t>
+        <w:t>5. Paso 4: Integración del Widget Flotante en la Web Municipal</w:t>
       </w:r>
     </w:p>
     <w:p>
@@ -1017,7 +1112,7 @@
         <w:spacing w:after="80"/>
       </w:pPr>
       <w:r>
-        <w:t>El equipo de desarrollo web solo debe pegar el siguiente fragmento HTML/JS en la plantilla global de la página web municipal (Strapi, WordPress, React o HTML puro), antes de la etiqueta de cierre &lt;/body&gt;:</w:t>
+        <w:t>El equipo de desarrollo web solo debe pegar el siguiente fragmento HTML/JS en la plantilla global de la página web municipal (Strapi, WordPress, React o HTML puro), antes de la etiqueta de cierre &lt;/body&gt;. Para pruebas inmediatas, se puede utilizar el dominio de prueba de Cloudflare o el dominio oficial:</w:t>
       </w:r>
     </w:p>
     <w:tbl>
@@ -1051,13 +1146,13 @@
                 <w:color w:val="1E1E1E"/>
                 <w:sz w:val="18"/>
               </w:rPr>
-              <w:t>&lt;!-- Widget Ciudadano Cisternin --&gt;</w:t>
+              <w:t>&lt;!-- Widget Ciudadano Cisternin (Incrustación Web con Dominio Cloudflare) --&gt;</w:t>
               <w:br/>
               <w:t>&lt;div id="cisternin-widget" style="position: fixed; bottom: 20px; right: 20px; z-index: 999999;"&gt;</w:t>
               <w:br/>
               <w:t xml:space="preserve">  &lt;iframe </w:t>
               <w:br/>
-              <w:t xml:space="preserve">    src="https://chatbot.lacisterna.cl/chat" </w:t>
+              <w:t xml:space="preserve">    src="https://retrieved-too-lance-metabolism.trycloudflare.com/chat" </w:t>
               <w:br/>
               <w:t xml:space="preserve">    width="380" </w:t>
               <w:br/>
@@ -1070,6 +1165,8 @@
               <w:t xml:space="preserve">  &lt;/iframe&gt;</w:t>
               <w:br/>
               <w:t>&lt;/div&gt;</w:t>
+              <w:br/>
+              <w:t>&lt;!-- Nota: Al pasar a producción definitiva, reemplazar la URL por https://bot.aspenqlio.com/chat --&gt;</w:t>
             </w:r>
           </w:p>
         </w:tc>
@@ -1100,22 +1197,31 @@
         <w:spacing w:after="80"/>
       </w:pPr>
       <w:r>
-        <w:t xml:space="preserve">Una vez desplegado, el Administrador Municipal o los encargados de atención pueden ingresar a </w:t>
+        <w:t xml:space="preserve">Una vez desplegado con el dominio de Cloudflare, el Administrador Municipal o los encargados de atención pueden ingresar a </w:t>
       </w:r>
       <w:r>
         <w:rPr>
           <w:b/>
         </w:rPr>
-        <w:t>https://chatbot.lacisterna.cl/docs</w:t>
+        <w:t>https://retrieved-too-lance-metabolism.trycloudflare.com/docs</w:t>
       </w:r>
       <w:r>
-        <w:t xml:space="preserve"> y </w:t>
+        <w:t xml:space="preserve"> (o </w:t>
       </w:r>
       <w:r>
         <w:rPr>
           <w:b/>
         </w:rPr>
-        <w:t>https://chatbot.lacisterna.cl/admin</w:t>
+        <w:t>https://bot.aspenqlio.com/docs</w:t>
+      </w:r>
+      <w:r>
+        <w:t xml:space="preserve">) y </w:t>
+      </w:r>
+      <w:r>
+        <w:rPr>
+          <w:b/>
+        </w:rPr>
+        <w:t>/admin</w:t>
       </w:r>
       <w:r>
         <w:t xml:space="preserve"> para:</w:t>

</xml_diff>

<commit_message>
docs: actualizar guia de despliegue con dominio oficial chat.aspenqlio.com
</commit_message>
<xml_diff>
--- a/docs/Guia_Despliegue_Servidor_y_Tunel_Municipal.docx
+++ b/docs/Guia_Despliegue_Servidor_y_Tunel_Municipal.docx
@@ -746,16 +746,16 @@
         <w:spacing w:after="80"/>
       </w:pPr>
       <w:r>
-        <w:t xml:space="preserve">Para exponer el asistente en un dominio seguro con HTTPS y mitigación DDoS sin abrir puertos en el firewall institucional, se utiliza Cloudflare Tunnel (agente 'cloudflared'). El agente establece túneles salientes TLS hacia la red global de Cloudflare, permitiendo operar tanto en un dominio de prueba temporal gratuito como en el dominio oficial institucional (ej. </w:t>
+        <w:t xml:space="preserve">Para exponer el asistente en un dominio seguro con HTTPS y mitigación DDoS sin abrir puertos en el firewall institucional, se utiliza Cloudflare Tunnel (agente 'cloudflared'). El agente establece túneles salientes TLS hacia la red global de Cloudflare, permitiendo operar en el dominio oficial </w:t>
       </w:r>
       <w:r>
         <w:rPr>
           <w:b/>
         </w:rPr>
-        <w:t>bot.aspenqlio.com</w:t>
+        <w:t>chat.aspenqlio.com</w:t>
       </w:r>
       <w:r>
-        <w:t xml:space="preserve"> o </w:t>
+        <w:t xml:space="preserve"> (o el subdominio municipal que se asigne, ej. </w:t>
       </w:r>
       <w:r>
         <w:rPr>
@@ -792,7 +792,7 @@
         <w:t xml:space="preserve">Certificado SSL/TLS Automático: </w:t>
       </w:r>
       <w:r>
-        <w:t>Cloudflare gestiona el cifrado HTTPS y la renovación de certificados.</w:t>
+        <w:t>Cloudflare gestiona el cifrado HTTPS y la renovación automática de certificados.</w:t>
       </w:r>
     </w:p>
     <w:p>
@@ -821,7 +821,7 @@
           <w:color w:val="1F4E79"/>
           <w:sz w:val="24"/>
         </w:rPr>
-        <w:t>Modalidad A: Túnel Rápido de Prueba Inmediata (Sin Cuenta ni DNS)</w:t>
+        <w:t>Configuración del Túnel con el Dominio Oficial chat.aspenqlio.com</w:t>
       </w:r>
     </w:p>
     <w:p>
@@ -829,79 +829,7 @@
         <w:spacing w:after="80"/>
       </w:pPr>
       <w:r>
-        <w:t>Para pruebas inmediatas por el equipo de desarrollo web, se puede generar un túnel rápido que entrega un dominio público HTTPS al instante:</w:t>
-      </w:r>
-    </w:p>
-    <w:tbl>
-      <w:tblPr>
-        <w:tblW w:type="auto" w:w="0"/>
-        <w:jc w:val="center"/>
-        <w:tblLook w:firstColumn="1" w:firstRow="1" w:lastColumn="0" w:lastRow="0" w:noHBand="0" w:noVBand="1" w:val="04A0"/>
-      </w:tblPr>
-      <w:tblGrid>
-        <w:gridCol w:w="9936"/>
-      </w:tblGrid>
-      <w:tr>
-        <w:tc>
-          <w:tcPr>
-            <w:tcW w:type="dxa" w:w="9360"/>
-            <w:shd w:fill="F2F4F7"/>
-            <w:tcMar>
-              <w:top w:w="120" w:type="dxa"/>
-              <w:bottom w:w="120" w:type="dxa"/>
-              <w:left w:w="200" w:type="dxa"/>
-              <w:right w:w="200" w:type="dxa"/>
-            </w:tcMar>
-          </w:tcPr>
-          <w:p>
-            <w:pPr>
-              <w:spacing w:before="40" w:after="40"/>
-            </w:pPr>
-            <w:r>
-              <w:rPr>
-                <w:rFonts w:ascii="Consolas" w:hAnsi="Consolas"/>
-                <w:color w:val="1E1E1E"/>
-                <w:sz w:val="18"/>
-              </w:rPr>
-              <w:t># Levantar túnel de prueba temporal hacia el contenedor local</w:t>
-              <w:br/>
-              <w:t>cloudflared tunnel --url http://localhost:8000</w:t>
-              <w:br/>
-              <w:br/>
-              <w:t># Genera una URL pública segura accesible desde internet, ejemplo:</w:t>
-              <w:br/>
-              <w:t># https://retrieved-too-lance-metabolism.trycloudflare.com</w:t>
-            </w:r>
-          </w:p>
-        </w:tc>
-      </w:tr>
-    </w:tbl>
-    <w:p>
-      <w:pPr>
-        <w:spacing w:before="40" w:after="80"/>
-      </w:pPr>
-    </w:p>
-    <w:p>
-      <w:pPr>
-        <w:keepNext/>
-        <w:spacing w:before="240" w:after="80"/>
-      </w:pPr>
-      <w:r>
-        <w:rPr>
-          <w:rFonts w:ascii="Calibri" w:hAnsi="Calibri"/>
-          <w:b/>
-          <w:color w:val="1F4E79"/>
-          <w:sz w:val="24"/>
-        </w:rPr>
-        <w:t>Modalidad B: Dominio Institucional Oficial Permanente (con Cloudflare)</w:t>
-      </w:r>
-    </w:p>
-    <w:p>
-      <w:pPr>
-        <w:spacing w:after="80"/>
-      </w:pPr>
-      <w:r>
-        <w:t>Para asociar el túnel al dominio municipal oficial permanente:</w:t>
+        <w:t>Pasos para asociar el túnel al dominio oficial permanente:</w:t>
       </w:r>
     </w:p>
     <w:tbl>
@@ -944,21 +872,19 @@
               <w:t>sudo apt-get update &amp;&amp; sudo apt-get install -y cloudflared</w:t>
               <w:br/>
               <w:br/>
-              <w:t># 2. Autenticar la cuenta municipal de Cloudflare</w:t>
+              <w:t># 2. Autenticar la cuenta de Cloudflare</w:t>
               <w:br/>
               <w:t>cloudflared tunnel login</w:t>
               <w:br/>
               <w:br/>
-              <w:t># 3. Crear el túnel nombrado</w:t>
+              <w:t># 3. Crear el túnel nombrado para el asistente</w:t>
               <w:br/>
               <w:t>cloudflared tunnel create cisternin-produccion</w:t>
               <w:br/>
               <w:br/>
               <w:t># 4. Enrutar el dominio oficial hacia el túnel</w:t>
               <w:br/>
-              <w:t>cloudflared tunnel route dns cisternin-produccion bot.aspenqlio.com</w:t>
-              <w:br/>
-              <w:t># (o hacia el subdominio municipal: chatbot.lacisterna.cl)</w:t>
+              <w:t>cloudflared tunnel route dns cisternin-produccion chat.aspenqlio.com</w:t>
             </w:r>
           </w:p>
         </w:tc>
@@ -1021,11 +947,7 @@
               <w:br/>
               <w:t>ingress:</w:t>
               <w:br/>
-              <w:t xml:space="preserve">  - hostname: bot.aspenqlio.com</w:t>
-              <w:br/>
-              <w:t xml:space="preserve">    service: http://localhost:8000</w:t>
-              <w:br/>
-              <w:t xml:space="preserve">  - hostname: chatbot.lacisterna.cl</w:t>
+              <w:t xml:space="preserve">  - hostname: chat.aspenqlio.com</w:t>
               <w:br/>
               <w:t xml:space="preserve">    service: http://localhost:8000</w:t>
               <w:br/>
@@ -1112,7 +1034,7 @@
         <w:spacing w:after="80"/>
       </w:pPr>
       <w:r>
-        <w:t>El equipo de desarrollo web solo debe pegar el siguiente fragmento HTML/JS en la plantilla global de la página web municipal (Strapi, WordPress, React o HTML puro), antes de la etiqueta de cierre &lt;/body&gt;. Para pruebas inmediatas, se puede utilizar el dominio de prueba de Cloudflare o el dominio oficial:</w:t>
+        <w:t>El equipo de desarrollo web solo debe pegar el siguiente fragmento HTML/JS en la plantilla global de la página web municipal (Strapi, WordPress, React o HTML puro), antes de la etiqueta de cierre &lt;/body&gt;:</w:t>
       </w:r>
     </w:p>
     <w:tbl>
@@ -1146,13 +1068,13 @@
                 <w:color w:val="1E1E1E"/>
                 <w:sz w:val="18"/>
               </w:rPr>
-              <w:t>&lt;!-- Widget Ciudadano Cisternin (Incrustación Web con Dominio Cloudflare) --&gt;</w:t>
+              <w:t>&lt;!-- Widget Ciudadano Cisternin (Dominio Oficial chat.aspenqlio.com) --&gt;</w:t>
               <w:br/>
               <w:t>&lt;div id="cisternin-widget" style="position: fixed; bottom: 20px; right: 20px; z-index: 999999;"&gt;</w:t>
               <w:br/>
               <w:t xml:space="preserve">  &lt;iframe </w:t>
               <w:br/>
-              <w:t xml:space="preserve">    src="https://retrieved-too-lance-metabolism.trycloudflare.com/chat" </w:t>
+              <w:t xml:space="preserve">    src="https://chat.aspenqlio.com/chat" </w:t>
               <w:br/>
               <w:t xml:space="preserve">    width="380" </w:t>
               <w:br/>
@@ -1165,8 +1087,6 @@
               <w:t xml:space="preserve">  &lt;/iframe&gt;</w:t>
               <w:br/>
               <w:t>&lt;/div&gt;</w:t>
-              <w:br/>
-              <w:t>&lt;!-- Nota: Al pasar a producción definitiva, reemplazar la URL por https://bot.aspenqlio.com/chat --&gt;</w:t>
             </w:r>
           </w:p>
         </w:tc>
@@ -1197,31 +1117,22 @@
         <w:spacing w:after="80"/>
       </w:pPr>
       <w:r>
-        <w:t xml:space="preserve">Una vez desplegado con el dominio de Cloudflare, el Administrador Municipal o los encargados de atención pueden ingresar a </w:t>
+        <w:t xml:space="preserve">Una vez desplegado en el dominio oficial, el Administrador Municipal o los encargados de atención pueden ingresar a </w:t>
       </w:r>
       <w:r>
         <w:rPr>
           <w:b/>
         </w:rPr>
-        <w:t>https://retrieved-too-lance-metabolism.trycloudflare.com/docs</w:t>
+        <w:t>https://chat.aspenqlio.com/docs</w:t>
       </w:r>
       <w:r>
-        <w:t xml:space="preserve"> (o </w:t>
+        <w:t xml:space="preserve"> y </w:t>
       </w:r>
       <w:r>
         <w:rPr>
           <w:b/>
         </w:rPr>
-        <w:t>https://bot.aspenqlio.com/docs</w:t>
-      </w:r>
-      <w:r>
-        <w:t xml:space="preserve">) y </w:t>
-      </w:r>
-      <w:r>
-        <w:rPr>
-          <w:b/>
-        </w:rPr>
-        <w:t>/admin</w:t>
+        <w:t>https://chat.aspenqlio.com/admin</w:t>
       </w:r>
       <w:r>
         <w:t xml:space="preserve"> para:</w:t>

</xml_diff>